<commit_message>
fix: six-way code review fixes + virtual button frequency control
- STM32 critical fixes: ADC.c includes own header, ADC_ConvertedValue
  static, circular dependency broken (ESP8266_IsReady), OLED/ESP8266
  bounds guards, Key_List encapsulation, LED atomic GPIO toggle
- ESP8266 firmware: FreqAdd/FreqSub virtual buttons with auto-reset,
  set_reply for OneNET timeout fix, WiFiManager v2.x compatibility,
  MQTT address correction (mqtts.heclouds.com:1883)
- STM32 App_Net: CMD:F_UP / CMD:F_DOWN parsing with SS_DONE guard,
  frequency cap at 150k/95k
- Docs: V4.1 version bump, CLAUDE.md + README refresh, .docx re-gen
</commit_message>
<xml_diff>
--- a/Claude_Files/docs/双脑架构V4.0验证与烧录指南.docx
+++ b/Claude_Files/docs/双脑架构V4.0验证与烧录指南.docx
@@ -621,7 +621,7 @@
                 <w:sz w:val="20"/>
                 <w:szCs w:val="20"/>
               </w:rPr>
-              <w:t xml:space="preserve">MQTT 下发 `CMD:ON\n` / `CMD:OFF\n`</w:t>
+              <w:t xml:space="preserve">MQTT 下发 `CMD:ON\n` / `CMD:OFF\n` / `CMD:F_UP\n` / `CMD:F_DOWN\n`</w:t>
             </w:r>
           </w:p>
         </w:tc>
@@ -717,6 +717,386 @@
                 <w:szCs w:val="20"/>
               </w:rPr>
               <w:t xml:space="preserve">ESP8266 自管理 (WiFi/MQTT 自动重连)</w:t>
+            </w:r>
+          </w:p>
+        </w:tc>
+      </w:tr>
+      <w:tr>
+        <w:tc>
+          <w:tcPr>
+            <w:tcW w:type="dxa" w:w="3024"/>
+            <w:tcBorders>
+              <w:top w:val="single" w:color="CCCCCC" w:sz="1"/>
+              <w:left w:val="single" w:color="CCCCCC" w:sz="1"/>
+              <w:bottom w:val="single" w:color="CCCCCC" w:sz="1"/>
+              <w:right w:val="single" w:color="CCCCCC" w:sz="1"/>
+            </w:tcBorders>
+            <w:tcMar>
+              <w:top w:type="dxa" w:w="60"/>
+              <w:left w:type="dxa" w:w="100"/>
+              <w:bottom w:type="dxa" w:w="60"/>
+              <w:right w:type="dxa" w:w="100"/>
+            </w:tcMar>
+          </w:tcPr>
+          <w:p>
+            <w:pPr>
+              <w:spacing w:line="288"/>
+            </w:pPr>
+            <w:r>
+              <w:rPr>
+                <w:rFonts w:ascii="SimSun" w:cs="SimSun" w:eastAsia="SimSun" w:hAnsi="SimSun"/>
+                <w:color w:val="333333"/>
+                <w:sz w:val="20"/>
+                <w:szCs w:val="20"/>
+              </w:rPr>
+              <w:t xml:space="preserve">属性回复</w:t>
+            </w:r>
+          </w:p>
+        </w:tc>
+        <w:tc>
+          <w:tcPr>
+            <w:tcW w:type="dxa" w:w="3024"/>
+            <w:tcBorders>
+              <w:top w:val="single" w:color="CCCCCC" w:sz="1"/>
+              <w:left w:val="single" w:color="CCCCCC" w:sz="1"/>
+              <w:bottom w:val="single" w:color="CCCCCC" w:sz="1"/>
+              <w:right w:val="single" w:color="CCCCCC" w:sz="1"/>
+            </w:tcBorders>
+            <w:tcMar>
+              <w:top w:type="dxa" w:w="60"/>
+              <w:left w:type="dxa" w:w="100"/>
+              <w:bottom w:type="dxa" w:w="60"/>
+              <w:right w:type="dxa" w:w="100"/>
+            </w:tcMar>
+          </w:tcPr>
+          <w:p>
+            <w:pPr>
+              <w:spacing w:line="288"/>
+            </w:pPr>
+            <w:r>
+              <w:rPr>
+                <w:rFonts w:ascii="SimSun" w:cs="SimSun" w:eastAsia="SimSun" w:hAnsi="SimSun"/>
+                <w:color w:val="333333"/>
+                <w:sz w:val="20"/>
+                <w:szCs w:val="20"/>
+              </w:rPr>
+              <w:t xml:space="preserve">无</w:t>
+            </w:r>
+          </w:p>
+        </w:tc>
+        <w:tc>
+          <w:tcPr>
+            <w:tcW w:type="dxa" w:w="3024"/>
+            <w:tcBorders>
+              <w:top w:val="single" w:color="CCCCCC" w:sz="1"/>
+              <w:left w:val="single" w:color="CCCCCC" w:sz="1"/>
+              <w:bottom w:val="single" w:color="CCCCCC" w:sz="1"/>
+              <w:right w:val="single" w:color="CCCCCC" w:sz="1"/>
+            </w:tcBorders>
+            <w:tcMar>
+              <w:top w:type="dxa" w:w="60"/>
+              <w:left w:type="dxa" w:w="100"/>
+              <w:bottom w:type="dxa" w:w="60"/>
+              <w:right w:type="dxa" w:w="100"/>
+            </w:tcMar>
+          </w:tcPr>
+          <w:p>
+            <w:pPr>
+              <w:spacing w:line="288"/>
+            </w:pPr>
+            <w:r>
+              <w:rPr>
+                <w:rFonts w:ascii="SimSun" w:cs="SimSun" w:eastAsia="SimSun" w:hAnsi="SimSun"/>
+                <w:color w:val="333333"/>
+                <w:sz w:val="20"/>
+                <w:szCs w:val="20"/>
+              </w:rPr>
+              <w:t xml:space="preserve">MQTT `set_reply` 应答 (解决"响应超时")</w:t>
+            </w:r>
+          </w:p>
+        </w:tc>
+      </w:tr>
+      <w:tr>
+        <w:tc>
+          <w:tcPr>
+            <w:tcW w:type="dxa" w:w="3024"/>
+            <w:tcBorders>
+              <w:top w:val="single" w:color="CCCCCC" w:sz="1"/>
+              <w:left w:val="single" w:color="CCCCCC" w:sz="1"/>
+              <w:bottom w:val="single" w:color="CCCCCC" w:sz="1"/>
+              <w:right w:val="single" w:color="CCCCCC" w:sz="1"/>
+            </w:tcBorders>
+            <w:tcMar>
+              <w:top w:type="dxa" w:w="60"/>
+              <w:left w:type="dxa" w:w="100"/>
+              <w:bottom w:type="dxa" w:w="60"/>
+              <w:right w:type="dxa" w:w="100"/>
+            </w:tcMar>
+          </w:tcPr>
+          <w:p>
+            <w:pPr>
+              <w:spacing w:line="288"/>
+            </w:pPr>
+            <w:r>
+              <w:rPr>
+                <w:rFonts w:ascii="SimSun" w:cs="SimSun" w:eastAsia="SimSun" w:hAnsi="SimSun"/>
+                <w:color w:val="333333"/>
+                <w:sz w:val="20"/>
+                <w:szCs w:val="20"/>
+              </w:rPr>
+              <w:t xml:space="preserve">虚拟按键</w:t>
+            </w:r>
+          </w:p>
+        </w:tc>
+        <w:tc>
+          <w:tcPr>
+            <w:tcW w:type="dxa" w:w="3024"/>
+            <w:tcBorders>
+              <w:top w:val="single" w:color="CCCCCC" w:sz="1"/>
+              <w:left w:val="single" w:color="CCCCCC" w:sz="1"/>
+              <w:bottom w:val="single" w:color="CCCCCC" w:sz="1"/>
+              <w:right w:val="single" w:color="CCCCCC" w:sz="1"/>
+            </w:tcBorders>
+            <w:tcMar>
+              <w:top w:type="dxa" w:w="60"/>
+              <w:left w:type="dxa" w:w="100"/>
+              <w:bottom w:type="dxa" w:w="60"/>
+              <w:right w:type="dxa" w:w="100"/>
+            </w:tcMar>
+          </w:tcPr>
+          <w:p>
+            <w:pPr>
+              <w:spacing w:line="288"/>
+            </w:pPr>
+            <w:r>
+              <w:rPr>
+                <w:rFonts w:ascii="SimSun" w:cs="SimSun" w:eastAsia="SimSun" w:hAnsi="SimSun"/>
+                <w:color w:val="333333"/>
+                <w:sz w:val="20"/>
+                <w:szCs w:val="20"/>
+              </w:rPr>
+              <w:t xml:space="preserve">无</w:t>
+            </w:r>
+          </w:p>
+        </w:tc>
+        <w:tc>
+          <w:tcPr>
+            <w:tcW w:type="dxa" w:w="3024"/>
+            <w:tcBorders>
+              <w:top w:val="single" w:color="CCCCCC" w:sz="1"/>
+              <w:left w:val="single" w:color="CCCCCC" w:sz="1"/>
+              <w:bottom w:val="single" w:color="CCCCCC" w:sz="1"/>
+              <w:right w:val="single" w:color="CCCCCC" w:sz="1"/>
+            </w:tcBorders>
+            <w:tcMar>
+              <w:top w:type="dxa" w:w="60"/>
+              <w:left w:type="dxa" w:w="100"/>
+              <w:bottom w:type="dxa" w:w="60"/>
+              <w:right w:type="dxa" w:w="100"/>
+            </w:tcMar>
+          </w:tcPr>
+          <w:p>
+            <w:pPr>
+              <w:spacing w:line="288"/>
+            </w:pPr>
+            <w:r>
+              <w:rPr>
+                <w:rFonts w:ascii="SimSun" w:cs="SimSun" w:eastAsia="SimSun" w:hAnsi="SimSun"/>
+                <w:color w:val="333333"/>
+                <w:sz w:val="20"/>
+                <w:szCs w:val="20"/>
+              </w:rPr>
+              <w:t xml:space="preserve">FreqAdd/FreqSub 点动复位 (+/-1kHz)</w:t>
+            </w:r>
+          </w:p>
+        </w:tc>
+      </w:tr>
+      <w:tr>
+        <w:tc>
+          <w:tcPr>
+            <w:tcW w:type="dxa" w:w="3024"/>
+            <w:tcBorders>
+              <w:top w:val="single" w:color="CCCCCC" w:sz="1"/>
+              <w:left w:val="single" w:color="CCCCCC" w:sz="1"/>
+              <w:bottom w:val="single" w:color="CCCCCC" w:sz="1"/>
+              <w:right w:val="single" w:color="CCCCCC" w:sz="1"/>
+            </w:tcBorders>
+            <w:tcMar>
+              <w:top w:type="dxa" w:w="60"/>
+              <w:left w:type="dxa" w:w="100"/>
+              <w:bottom w:type="dxa" w:w="60"/>
+              <w:right w:type="dxa" w:w="100"/>
+            </w:tcMar>
+          </w:tcPr>
+          <w:p>
+            <w:pPr>
+              <w:spacing w:line="288"/>
+            </w:pPr>
+            <w:r>
+              <w:rPr>
+                <w:rFonts w:ascii="SimSun" w:cs="SimSun" w:eastAsia="SimSun" w:hAnsi="SimSun"/>
+                <w:color w:val="333333"/>
+                <w:sz w:val="20"/>
+                <w:szCs w:val="20"/>
+              </w:rPr>
+              <w:t xml:space="preserve">ESP8266 配网</w:t>
+            </w:r>
+          </w:p>
+        </w:tc>
+        <w:tc>
+          <w:tcPr>
+            <w:tcW w:type="dxa" w:w="3024"/>
+            <w:tcBorders>
+              <w:top w:val="single" w:color="CCCCCC" w:sz="1"/>
+              <w:left w:val="single" w:color="CCCCCC" w:sz="1"/>
+              <w:bottom w:val="single" w:color="CCCCCC" w:sz="1"/>
+              <w:right w:val="single" w:color="CCCCCC" w:sz="1"/>
+            </w:tcBorders>
+            <w:tcMar>
+              <w:top w:type="dxa" w:w="60"/>
+              <w:left w:type="dxa" w:w="100"/>
+              <w:bottom w:type="dxa" w:w="60"/>
+              <w:right w:type="dxa" w:w="100"/>
+            </w:tcMar>
+          </w:tcPr>
+          <w:p>
+            <w:pPr>
+              <w:spacing w:line="288"/>
+            </w:pPr>
+            <w:r>
+              <w:rPr>
+                <w:rFonts w:ascii="SimSun" w:cs="SimSun" w:eastAsia="SimSun" w:hAnsi="SimSun"/>
+                <w:color w:val="333333"/>
+                <w:sz w:val="20"/>
+                <w:szCs w:val="20"/>
+              </w:rPr>
+              <w:t xml:space="preserve">AT 指令</w:t>
+            </w:r>
+          </w:p>
+        </w:tc>
+        <w:tc>
+          <w:tcPr>
+            <w:tcW w:type="dxa" w:w="3024"/>
+            <w:tcBorders>
+              <w:top w:val="single" w:color="CCCCCC" w:sz="1"/>
+              <w:left w:val="single" w:color="CCCCCC" w:sz="1"/>
+              <w:bottom w:val="single" w:color="CCCCCC" w:sz="1"/>
+              <w:right w:val="single" w:color="CCCCCC" w:sz="1"/>
+            </w:tcBorders>
+            <w:tcMar>
+              <w:top w:type="dxa" w:w="60"/>
+              <w:left w:type="dxa" w:w="100"/>
+              <w:bottom w:type="dxa" w:w="60"/>
+              <w:right w:type="dxa" w:w="100"/>
+            </w:tcMar>
+          </w:tcPr>
+          <w:p>
+            <w:pPr>
+              <w:spacing w:line="288"/>
+            </w:pPr>
+            <w:r>
+              <w:rPr>
+                <w:rFonts w:ascii="SimSun" w:cs="SimSun" w:eastAsia="SimSun" w:hAnsi="SimSun"/>
+                <w:color w:val="333333"/>
+                <w:sz w:val="20"/>
+                <w:szCs w:val="20"/>
+              </w:rPr>
+              <w:t xml:space="preserve">WiFiManager v2.x 网页配网 (需 startConfigPortal 兜底)</w:t>
+            </w:r>
+          </w:p>
+        </w:tc>
+      </w:tr>
+      <w:tr>
+        <w:tc>
+          <w:tcPr>
+            <w:tcW w:type="dxa" w:w="3024"/>
+            <w:tcBorders>
+              <w:top w:val="single" w:color="CCCCCC" w:sz="1"/>
+              <w:left w:val="single" w:color="CCCCCC" w:sz="1"/>
+              <w:bottom w:val="single" w:color="CCCCCC" w:sz="1"/>
+              <w:right w:val="single" w:color="CCCCCC" w:sz="1"/>
+            </w:tcBorders>
+            <w:tcMar>
+              <w:top w:type="dxa" w:w="60"/>
+              <w:left w:type="dxa" w:w="100"/>
+              <w:bottom w:type="dxa" w:w="60"/>
+              <w:right w:type="dxa" w:w="100"/>
+            </w:tcMar>
+          </w:tcPr>
+          <w:p>
+            <w:pPr>
+              <w:spacing w:line="288"/>
+            </w:pPr>
+            <w:r>
+              <w:rPr>
+                <w:rFonts w:ascii="SimSun" w:cs="SimSun" w:eastAsia="SimSun" w:hAnsi="SimSun"/>
+                <w:color w:val="333333"/>
+                <w:sz w:val="20"/>
+                <w:szCs w:val="20"/>
+              </w:rPr>
+              <w:t xml:space="preserve">MQTT 地址</w:t>
+            </w:r>
+          </w:p>
+        </w:tc>
+        <w:tc>
+          <w:tcPr>
+            <w:tcW w:type="dxa" w:w="3024"/>
+            <w:tcBorders>
+              <w:top w:val="single" w:color="CCCCCC" w:sz="1"/>
+              <w:left w:val="single" w:color="CCCCCC" w:sz="1"/>
+              <w:bottom w:val="single" w:color="CCCCCC" w:sz="1"/>
+              <w:right w:val="single" w:color="CCCCCC" w:sz="1"/>
+            </w:tcBorders>
+            <w:tcMar>
+              <w:top w:type="dxa" w:w="60"/>
+              <w:left w:type="dxa" w:w="100"/>
+              <w:bottom w:type="dxa" w:w="60"/>
+              <w:right w:type="dxa" w:w="100"/>
+            </w:tcMar>
+          </w:tcPr>
+          <w:p>
+            <w:pPr>
+              <w:spacing w:line="288"/>
+            </w:pPr>
+            <w:r>
+              <w:rPr>
+                <w:rFonts w:ascii="SimSun" w:cs="SimSun" w:eastAsia="SimSun" w:hAnsi="SimSun"/>
+                <w:color w:val="333333"/>
+                <w:sz w:val="20"/>
+                <w:szCs w:val="20"/>
+              </w:rPr>
+              <w:t xml:space="preserve">巴法云</w:t>
+            </w:r>
+          </w:p>
+        </w:tc>
+        <w:tc>
+          <w:tcPr>
+            <w:tcW w:type="dxa" w:w="3024"/>
+            <w:tcBorders>
+              <w:top w:val="single" w:color="CCCCCC" w:sz="1"/>
+              <w:left w:val="single" w:color="CCCCCC" w:sz="1"/>
+              <w:bottom w:val="single" w:color="CCCCCC" w:sz="1"/>
+              <w:right w:val="single" w:color="CCCCCC" w:sz="1"/>
+            </w:tcBorders>
+            <w:tcMar>
+              <w:top w:type="dxa" w:w="60"/>
+              <w:left w:type="dxa" w:w="100"/>
+              <w:bottom w:type="dxa" w:w="60"/>
+              <w:right w:type="dxa" w:w="100"/>
+            </w:tcMar>
+          </w:tcPr>
+          <w:p>
+            <w:pPr>
+              <w:spacing w:line="288"/>
+            </w:pPr>
+            <w:r>
+              <w:rPr>
+                <w:rFonts w:ascii="SimSun" w:cs="SimSun" w:eastAsia="SimSun" w:hAnsi="SimSun"/>
+                <w:color w:val="333333"/>
+                <w:sz w:val="20"/>
+                <w:szCs w:val="20"/>
+              </w:rPr>
+              <w:t xml:space="preserve">`mqtts.heclouds.com:1883` (OneNET Studio, s=Studio 非 Secure)</w:t>
             </w:r>
           </w:p>
         </w:tc>
@@ -1094,7 +1474,8 @@
           <w:sz w:val="22"/>
           <w:szCs w:val="22"/>
         </w:rPr>
-        <w:t xml:space="preserve">1. Keil MDK 编译 `PWM/Project.uvprojx`，烧录到 STM32</w:t>
+        <w:t xml:space="preserve">1. Keil MDK 编译 `PWM/Project.uvprojx`，烧录到 STM32
+</w:t>
       </w:r>
     </w:p>
     <w:p>
@@ -1128,7 +1509,8 @@
           <w:sz w:val="22"/>
           <w:szCs w:val="22"/>
         </w:rPr>
-        <w:t xml:space="preserve">，选择对应 COM 口</w:t>
+        <w:t xml:space="preserve">，选择对应 COM 口
+</w:t>
       </w:r>
     </w:p>
     <w:p>
@@ -1142,7 +1524,8 @@
           <w:sz w:val="22"/>
           <w:szCs w:val="22"/>
         </w:rPr>
-        <w:t xml:space="preserve">3. 观察上电后 OLED 显示 `Wireless Charge` → `Press KEY0 WiFi`</w:t>
+        <w:t xml:space="preserve">3. 观察上电后 OLED 显示 `Wireless Charge` → `Press KEY0 WiFi`
+</w:t>
       </w:r>
     </w:p>
     <w:p>
@@ -1176,7 +1559,8 @@
           <w:sz w:val="22"/>
           <w:szCs w:val="22"/>
         </w:rPr>
-        <w:t xml:space="preserve">：OLED 显示 `HW Init...`，等待约 3 秒后显示 `WiFi: READY`</w:t>
+        <w:t xml:space="preserve">：OLED 显示 `HW Init...`，等待约 3 秒后显示 `WiFi: READY`
+</w:t>
       </w:r>
     </w:p>
     <w:p>
@@ -1210,7 +1594,8 @@
           <w:sz w:val="22"/>
           <w:szCs w:val="22"/>
         </w:rPr>
-        <w:t xml:space="preserve"> 收到一行 JSON：</w:t>
+        <w:t xml:space="preserve"> 收到一行 JSON：
+</w:t>
       </w:r>
     </w:p>
     <w:p/>
@@ -1227,7 +1612,8 @@
           <w:sz w:val="19"/>
           <w:szCs w:val="19"/>
         </w:rPr>
-        <w:t xml:space="preserve">{"V":12.50,"I":1.23,"F":100000}</w:t>
+        <w:t xml:space="preserve">{"V":12.50,"I":1.23,"F":100000}
+</w:t>
       </w:r>
     </w:p>
     <w:p/>
@@ -1262,7 +1648,8 @@
           <w:sz w:val="22"/>
           <w:szCs w:val="22"/>
         </w:rPr>
-        <w:t xml:space="preserve">以下字符串测试控制：</w:t>
+        <w:t xml:space="preserve">以下字符串测试控制：
+</w:t>
       </w:r>
     </w:p>
     <w:p/>
@@ -1475,6 +1862,134 @@
           </w:p>
         </w:tc>
       </w:tr>
+      <w:tr>
+        <w:tc>
+          <w:tcPr>
+            <w:tcW w:type="dxa" w:w="4536"/>
+            <w:tcBorders>
+              <w:top w:val="single" w:color="CCCCCC" w:sz="1"/>
+              <w:left w:val="single" w:color="CCCCCC" w:sz="1"/>
+              <w:bottom w:val="single" w:color="CCCCCC" w:sz="1"/>
+              <w:right w:val="single" w:color="CCCCCC" w:sz="1"/>
+            </w:tcBorders>
+            <w:tcMar>
+              <w:top w:type="dxa" w:w="60"/>
+              <w:left w:type="dxa" w:w="100"/>
+              <w:bottom w:type="dxa" w:w="60"/>
+              <w:right w:type="dxa" w:w="100"/>
+            </w:tcMar>
+          </w:tcPr>
+          <w:p>
+            <w:pPr>
+              <w:spacing w:line="288"/>
+            </w:pPr>
+            <w:r>
+              <w:rPr>
+                <w:rFonts w:ascii="SimSun" w:cs="SimSun" w:eastAsia="SimSun" w:hAnsi="SimSun"/>
+                <w:color w:val="333333"/>
+                <w:sz w:val="20"/>
+                <w:szCs w:val="20"/>
+              </w:rPr>
+              <w:t xml:space="preserve">`CMD:F_UP\n`</w:t>
+            </w:r>
+          </w:p>
+        </w:tc>
+        <w:tc>
+          <w:tcPr>
+            <w:tcW w:type="dxa" w:w="4536"/>
+            <w:tcBorders>
+              <w:top w:val="single" w:color="CCCCCC" w:sz="1"/>
+              <w:left w:val="single" w:color="CCCCCC" w:sz="1"/>
+              <w:bottom w:val="single" w:color="CCCCCC" w:sz="1"/>
+              <w:right w:val="single" w:color="CCCCCC" w:sz="1"/>
+            </w:tcBorders>
+            <w:tcMar>
+              <w:top w:type="dxa" w:w="60"/>
+              <w:left w:type="dxa" w:w="100"/>
+              <w:bottom w:type="dxa" w:w="60"/>
+              <w:right w:type="dxa" w:w="100"/>
+            </w:tcMar>
+          </w:tcPr>
+          <w:p>
+            <w:pPr>
+              <w:spacing w:line="288"/>
+            </w:pPr>
+            <w:r>
+              <w:rPr>
+                <w:rFonts w:ascii="SimSun" w:cs="SimSun" w:eastAsia="SimSun" w:hAnsi="SimSun"/>
+                <w:color w:val="333333"/>
+                <w:sz w:val="20"/>
+                <w:szCs w:val="20"/>
+              </w:rPr>
+              <w:t xml:space="preserve">OLED 显示 `CMD: Freq +1kHz`，频率 +1kHz (仅 SS_DONE 状态)</w:t>
+            </w:r>
+          </w:p>
+        </w:tc>
+      </w:tr>
+      <w:tr>
+        <w:tc>
+          <w:tcPr>
+            <w:tcW w:type="dxa" w:w="4536"/>
+            <w:tcBorders>
+              <w:top w:val="single" w:color="CCCCCC" w:sz="1"/>
+              <w:left w:val="single" w:color="CCCCCC" w:sz="1"/>
+              <w:bottom w:val="single" w:color="CCCCCC" w:sz="1"/>
+              <w:right w:val="single" w:color="CCCCCC" w:sz="1"/>
+            </w:tcBorders>
+            <w:tcMar>
+              <w:top w:type="dxa" w:w="60"/>
+              <w:left w:type="dxa" w:w="100"/>
+              <w:bottom w:type="dxa" w:w="60"/>
+              <w:right w:type="dxa" w:w="100"/>
+            </w:tcMar>
+          </w:tcPr>
+          <w:p>
+            <w:pPr>
+              <w:spacing w:line="288"/>
+            </w:pPr>
+            <w:r>
+              <w:rPr>
+                <w:rFonts w:ascii="SimSun" w:cs="SimSun" w:eastAsia="SimSun" w:hAnsi="SimSun"/>
+                <w:color w:val="333333"/>
+                <w:sz w:val="20"/>
+                <w:szCs w:val="20"/>
+              </w:rPr>
+              <w:t xml:space="preserve">`CMD:F_DOWN\n`</w:t>
+            </w:r>
+          </w:p>
+        </w:tc>
+        <w:tc>
+          <w:tcPr>
+            <w:tcW w:type="dxa" w:w="4536"/>
+            <w:tcBorders>
+              <w:top w:val="single" w:color="CCCCCC" w:sz="1"/>
+              <w:left w:val="single" w:color="CCCCCC" w:sz="1"/>
+              <w:bottom w:val="single" w:color="CCCCCC" w:sz="1"/>
+              <w:right w:val="single" w:color="CCCCCC" w:sz="1"/>
+            </w:tcBorders>
+            <w:tcMar>
+              <w:top w:type="dxa" w:w="60"/>
+              <w:left w:type="dxa" w:w="100"/>
+              <w:bottom w:type="dxa" w:w="60"/>
+              <w:right w:type="dxa" w:w="100"/>
+            </w:tcMar>
+          </w:tcPr>
+          <w:p>
+            <w:pPr>
+              <w:spacing w:line="288"/>
+            </w:pPr>
+            <w:r>
+              <w:rPr>
+                <w:rFonts w:ascii="SimSun" w:cs="SimSun" w:eastAsia="SimSun" w:hAnsi="SimSun"/>
+                <w:color w:val="333333"/>
+                <w:sz w:val="20"/>
+                <w:szCs w:val="20"/>
+              </w:rPr>
+              <w:t xml:space="preserve">OLED 显示 `CMD: Freq -1kHz`，频率 -1kHz (仅 SS_DONE 状态, 下限 95kHz)</w:t>
+            </w:r>
+          </w:p>
+        </w:tc>
+      </w:tr>
     </w:tbl>
     <w:p/>
     <w:p/>
@@ -1496,6 +2011,26 @@
           <w:szCs w:val="20"/>
         </w:rPr>
         <w:t xml:space="preserve">注意：必须以 `\n` (换行符) 结尾，否则 STM32 的帧检测不会触发。</w:t>
+      </w:r>
+    </w:p>
+    <w:p>
+      <w:pPr>
+        <w:pBdr>
+          <w:left w:val="single" w:color="2B579A" w:sz="12" w:space="8"/>
+        </w:pBdr>
+        <w:spacing w:line="360"/>
+        <w:ind w:left="360"/>
+      </w:pPr>
+      <w:r>
+        <w:rPr>
+          <w:rFonts w:ascii="SimSun" w:cs="SimSun" w:eastAsia="SimSun" w:hAnsi="SimSun"/>
+          <w:i/>
+          <w:iCs/>
+          <w:color w:val="555555"/>
+          <w:sz w:val="20"/>
+          <w:szCs w:val="20"/>
+        </w:rPr>
+        <w:t xml:space="preserve">CMD:F_UP/F_DOWN 仅当逆变器处于谐振运行态 (SS_DONE) 时生效，其他状态静默忽略。</w:t>
       </w:r>
     </w:p>
     <w:p/>
@@ -1528,7 +2063,8 @@
           <w:sz w:val="22"/>
           <w:szCs w:val="22"/>
         </w:rPr>
-        <w:t xml:space="preserve">即使没有 USB-TTL 模块，也可以通过 OLED 和 LED 验证：</w:t>
+        <w:t xml:space="preserve">即使没有 USB-TTL 模块，也可以通过 OLED 和 LED 验证：
+</w:t>
       </w:r>
     </w:p>
     <w:p/>
@@ -1563,7 +2099,8 @@
           <w:sz w:val="22"/>
           <w:szCs w:val="22"/>
         </w:rPr>
-        <w:t xml:space="preserve">：PB5 (Ready LED) 常亮 → 表示 `App_Net_Init()` 成功返回</w:t>
+        <w:t xml:space="preserve">：PB5 (Ready LED) 常亮 → 表示 `App_Net_Init()` 成功返回
+</w:t>
       </w:r>
     </w:p>
     <w:p>
@@ -1597,7 +2134,8 @@
           <w:sz w:val="22"/>
           <w:szCs w:val="22"/>
         </w:rPr>
-        <w:t xml:space="preserve">：常亮 → `s_WiFiConnected = 1` 生效</w:t>
+        <w:t xml:space="preserve">：常亮 → `s_WiFiConnected = 1` 生效
+</w:t>
       </w:r>
     </w:p>
     <w:p>
@@ -1631,7 +2169,8 @@
           <w:sz w:val="22"/>
           <w:szCs w:val="22"/>
         </w:rPr>
-        <w:t xml:space="preserve">（SS_IDLE 状态）：逆变器软启动扫频正常执行</w:t>
+        <w:t xml:space="preserve">（SS_IDLE 状态）：逆变器软启动扫频正常执行
+</w:t>
       </w:r>
     </w:p>
     <w:p/>
@@ -1690,7 +2229,8 @@
           <w:sz w:val="22"/>
           <w:szCs w:val="22"/>
         </w:rPr>
-        <w:t xml:space="preserve">1. 下载安装 [Arduino IDE](https://www.arduino.cc/en/software) (1.8.x 或 2.x 均可)</w:t>
+        <w:t xml:space="preserve">1. 下载安装 [Arduino IDE](https://www.arduino.cc/en/software) (1.8.x 或 2.x 均可)
+</w:t>
       </w:r>
     </w:p>
     <w:p/>
@@ -1705,7 +2245,8 @@
           <w:sz w:val="22"/>
           <w:szCs w:val="22"/>
         </w:rPr>
-        <w:t xml:space="preserve">2. 添加 ESP8266 开发板支持：</w:t>
+        <w:t xml:space="preserve">2. 添加 ESP8266 开发板支持：
+</w:t>
       </w:r>
     </w:p>
     <w:p/>
@@ -1720,7 +2261,8 @@
           <w:sz w:val="22"/>
           <w:szCs w:val="22"/>
         </w:rPr>
-        <w:t xml:space="preserve">   - 文件 → 首选项 → 附加开发板管理器网址</w:t>
+        <w:t xml:space="preserve">   - 文件 → 首选项 → 附加开发板管理器网址
+</w:t>
       </w:r>
     </w:p>
     <w:p>
@@ -1734,7 +2276,8 @@
           <w:sz w:val="22"/>
           <w:szCs w:val="22"/>
         </w:rPr>
-        <w:t xml:space="preserve">   - 填入：`http://arduino.esp8266.com/stable/package_esp8266com_index.json`</w:t>
+        <w:t xml:space="preserve">   - 填入：`http://arduino.esp8266.com/stable/package_esp8266com_index.json`
+</w:t>
       </w:r>
     </w:p>
     <w:p>
@@ -1748,7 +2291,8 @@
           <w:sz w:val="22"/>
           <w:szCs w:val="22"/>
         </w:rPr>
-        <w:t xml:space="preserve">   - 工具 → 开发板 → 开发板管理器</w:t>
+        <w:t xml:space="preserve">   - 工具 → 开发板 → 开发板管理器
+</w:t>
       </w:r>
     </w:p>
     <w:p>
@@ -1762,7 +2306,8 @@
           <w:sz w:val="22"/>
           <w:szCs w:val="22"/>
         </w:rPr>
-        <w:t xml:space="preserve">   - 搜索 `ESP8266` → 安装 `esp8266 by ESP8266 Community` (3.x 版本)</w:t>
+        <w:t xml:space="preserve">   - 搜索 `ESP8266` → 安装 `esp8266 by ESP8266 Community` (3.x 版本)
+</w:t>
       </w:r>
     </w:p>
     <w:p/>
@@ -1777,7 +2322,8 @@
           <w:sz w:val="22"/>
           <w:szCs w:val="22"/>
         </w:rPr>
-        <w:t xml:space="preserve">3. 安装 PubSubClient 库：</w:t>
+        <w:t xml:space="preserve">3. 安装 PubSubClient 库：
+</w:t>
       </w:r>
     </w:p>
     <w:p/>
@@ -1792,7 +2338,8 @@
           <w:sz w:val="22"/>
           <w:szCs w:val="22"/>
         </w:rPr>
-        <w:t xml:space="preserve">   - 工具 → 管理库</w:t>
+        <w:t xml:space="preserve">   - 工具 → 管理库
+</w:t>
       </w:r>
     </w:p>
     <w:p>
@@ -1806,7 +2353,8 @@
           <w:sz w:val="22"/>
           <w:szCs w:val="22"/>
         </w:rPr>
-        <w:t xml:space="preserve">   - 搜索 `PubSubClient` → 安装 `PubSubClient by Nick O'Leary`</w:t>
+        <w:t xml:space="preserve">   - 搜索 `PubSubClient` → 安装 `PubSubClient by Nick O'Leary`
+</w:t>
       </w:r>
     </w:p>
     <w:p/>
@@ -1839,7 +2387,8 @@
           <w:sz w:val="22"/>
           <w:szCs w:val="22"/>
         </w:rPr>
-        <w:t xml:space="preserve">打开 `ArduinoProject/ESP8266_MQTT_Firmware/ESP8266_MQTT_Firmware.ino`，修改以下宏：</w:t>
+        <w:t xml:space="preserve">打开 `ArduinoProject/ESP8266_MQTT_Firmware/ESP8266_MQTT_Firmware.ino`，修改以下宏：
+</w:t>
       </w:r>
     </w:p>
     <w:p/>
@@ -1856,7 +2405,8 @@
           <w:sz w:val="19"/>
           <w:szCs w:val="19"/>
         </w:rPr>
-        <w:t xml:space="preserve">#define WIFI_SSID       "你的WiFi名称"</w:t>
+        <w:t xml:space="preserve">#define WIFI_SSID       "你的WiFi名称"
+</w:t>
       </w:r>
     </w:p>
     <w:p>
@@ -1872,7 +2422,8 @@
           <w:sz w:val="19"/>
           <w:szCs w:val="19"/>
         </w:rPr>
-        <w:t xml:space="preserve">#define WIFI_PASSWORD   "你的WiFi密码"</w:t>
+        <w:t xml:space="preserve">#define WIFI_PASSWORD   "你的WiFi密码"
+</w:t>
       </w:r>
     </w:p>
     <w:p>
@@ -1888,7 +2439,8 @@
           <w:sz w:val="19"/>
           <w:szCs w:val="19"/>
         </w:rPr>
-        <w:t xml:space="preserve"/>
+        <w:t xml:space="preserve">
+</w:t>
       </w:r>
     </w:p>
     <w:p>
@@ -1904,7 +2456,8 @@
           <w:sz w:val="19"/>
           <w:szCs w:val="19"/>
         </w:rPr>
-        <w:t xml:space="preserve">#define MQTT_SERVER     "mqtt.heclouds.com"     // OneNET MQTT 地址</w:t>
+        <w:t xml:space="preserve">#define MQTT_SERVER     "mqtt.heclouds.com"     // OneNET MQTT 地址
+</w:t>
       </w:r>
     </w:p>
     <w:p>
@@ -1920,7 +2473,8 @@
           <w:sz w:val="19"/>
           <w:szCs w:val="19"/>
         </w:rPr>
-        <w:t xml:space="preserve">#define MQTT_PORT       6002</w:t>
+        <w:t xml:space="preserve">#define MQTT_PORT       6002
+</w:t>
       </w:r>
     </w:p>
     <w:p>
@@ -1936,7 +2490,8 @@
           <w:sz w:val="19"/>
           <w:szCs w:val="19"/>
         </w:rPr>
-        <w:t xml:space="preserve"/>
+        <w:t xml:space="preserve">
+</w:t>
       </w:r>
     </w:p>
     <w:p>
@@ -1952,7 +2507,8 @@
           <w:sz w:val="19"/>
           <w:szCs w:val="19"/>
         </w:rPr>
-        <w:t xml:space="preserve">#define MQTT_CLIENT_ID  "WPT_PWM_001"</w:t>
+        <w:t xml:space="preserve">#define MQTT_CLIENT_ID  "WPT_PWM_001"
+</w:t>
       </w:r>
     </w:p>
     <w:p>
@@ -1968,7 +2524,8 @@
           <w:sz w:val="19"/>
           <w:szCs w:val="19"/>
         </w:rPr>
-        <w:t xml:space="preserve">#define MQTT_USERNAME   "你的OneNET产品ID"</w:t>
+        <w:t xml:space="preserve">#define MQTT_USERNAME   "你的OneNET产品ID"
+</w:t>
       </w:r>
     </w:p>
     <w:p>
@@ -1984,7 +2541,8 @@
           <w:sz w:val="19"/>
           <w:szCs w:val="19"/>
         </w:rPr>
-        <w:t xml:space="preserve">#define MQTT_PASSWORD   "你的OneNET鉴权信息"</w:t>
+        <w:t xml:space="preserve">#define MQTT_PASSWORD   "你的OneNET鉴权信息"
+</w:t>
       </w:r>
     </w:p>
     <w:p/>
@@ -2058,7 +2616,8 @@
           <w:sz w:val="22"/>
           <w:szCs w:val="22"/>
         </w:rPr>
-        <w:t xml:space="preserve">：USB-TTL 模块连接 ESP8266-01</w:t>
+        <w:t xml:space="preserve">：USB-TTL 模块连接 ESP8266-01
+</w:t>
       </w:r>
     </w:p>
     <w:p/>
@@ -2454,7 +3013,8 @@
           <w:sz w:val="22"/>
           <w:szCs w:val="22"/>
         </w:rPr>
-        <w:t xml:space="preserve">：</w:t>
+        <w:t xml:space="preserve">：
+</w:t>
       </w:r>
     </w:p>
     <w:p/>
@@ -2489,7 +3049,8 @@
           <w:sz w:val="22"/>
           <w:szCs w:val="22"/>
         </w:rPr>
-        <w:t xml:space="preserve"/>
+        <w:t xml:space="preserve">
+</w:t>
       </w:r>
     </w:p>
     <w:p>
@@ -2503,7 +3064,8 @@
           <w:sz w:val="22"/>
           <w:szCs w:val="22"/>
         </w:rPr>
-        <w:t xml:space="preserve">   - Flash Size: `1M (no SPIFFS)`</w:t>
+        <w:t xml:space="preserve">   - Flash Size: `1M (no SPIFFS)`
+</w:t>
       </w:r>
     </w:p>
     <w:p>
@@ -2517,7 +3079,8 @@
           <w:sz w:val="22"/>
           <w:szCs w:val="22"/>
         </w:rPr>
-        <w:t xml:space="preserve">   - Upload Speed: `115200`</w:t>
+        <w:t xml:space="preserve">   - Upload Speed: `115200`
+</w:t>
       </w:r>
     </w:p>
     <w:p>
@@ -2531,7 +3094,8 @@
           <w:sz w:val="22"/>
           <w:szCs w:val="22"/>
         </w:rPr>
-        <w:t xml:space="preserve">   - CPU Frequency: `80 MHz`</w:t>
+        <w:t xml:space="preserve">   - CPU Frequency: `80 MHz`
+</w:t>
       </w:r>
     </w:p>
     <w:p/>
@@ -2566,7 +3130,8 @@
           <w:sz w:val="22"/>
           <w:szCs w:val="22"/>
         </w:rPr>
-        <w:t xml:space="preserve"> (→) 按钮，等待编译和烧录完成</w:t>
+        <w:t xml:space="preserve"> (→) 按钮，等待编译和烧录完成
+</w:t>
       </w:r>
     </w:p>
     <w:p/>
@@ -2601,7 +3166,8 @@
           <w:sz w:val="22"/>
           <w:szCs w:val="22"/>
         </w:rPr>
-        <w:t xml:space="preserve"> → 重新上电 ESP8266</w:t>
+        <w:t xml:space="preserve"> → 重新上电 ESP8266
+</w:t>
       </w:r>
     </w:p>
     <w:p/>
@@ -2654,7 +3220,8 @@
           <w:sz w:val="22"/>
           <w:szCs w:val="22"/>
         </w:rPr>
-        <w:t xml:space="preserve">)，观察：</w:t>
+        <w:t xml:space="preserve">)，观察：
+</w:t>
       </w:r>
     </w:p>
     <w:p/>
@@ -2669,7 +3236,8 @@
           <w:sz w:val="22"/>
           <w:szCs w:val="22"/>
         </w:rPr>
-        <w:t xml:space="preserve">1. ESP8266 上电后连接 WiFi（板载蓝灯闪烁）</w:t>
+        <w:t xml:space="preserve">1. ESP8266 上电后连接 WiFi（板载蓝灯闪烁）
+</w:t>
       </w:r>
     </w:p>
     <w:p>
@@ -2683,7 +3251,8 @@
           <w:sz w:val="22"/>
           <w:szCs w:val="22"/>
         </w:rPr>
-        <w:t xml:space="preserve">2. WiFi 连接成功后连接 MQTT</w:t>
+        <w:t xml:space="preserve">2. WiFi 连接成功后连接 MQTT
+</w:t>
       </w:r>
     </w:p>
     <w:p>
@@ -2717,7 +3286,8 @@
           <w:sz w:val="22"/>
           <w:szCs w:val="22"/>
         </w:rPr>
-        <w:t xml:space="preserve"> `{"V":12.5,"I":1.2,"F":100000}` → 串口监视器无回显（数据已发布到 MQTT）</w:t>
+        <w:t xml:space="preserve"> `{"V":12.5,"I":1.2,"F":100000}` → 串口监视器无回显（数据已发布到 MQTT）
+</w:t>
       </w:r>
     </w:p>
     <w:p>
@@ -2731,7 +3301,8 @@
           <w:sz w:val="22"/>
           <w:szCs w:val="22"/>
         </w:rPr>
-        <w:t xml:space="preserve">4. 在 MQTT 平台向订阅主题 `CMD` 发送 `ON` → 串口监视器应输出 `CMD:ON`</w:t>
+        <w:t xml:space="preserve">4. 在 MQTT 平台向订阅主题 `CMD` 发送 `ON` → 串口监视器应输出 `CMD:ON`
+</w:t>
       </w:r>
     </w:p>
     <w:p/>
@@ -2792,7 +3363,8 @@
           <w:sz w:val="19"/>
           <w:szCs w:val="19"/>
         </w:rPr>
-        <w:t xml:space="preserve">STM32 PA2 (TX) ──── ESP8266 RXD</w:t>
+        <w:t xml:space="preserve">STM32 PA2 (TX) ──── ESP8266 RXD
+</w:t>
       </w:r>
     </w:p>
     <w:p>
@@ -2808,7 +3380,8 @@
           <w:sz w:val="19"/>
           <w:szCs w:val="19"/>
         </w:rPr>
-        <w:t xml:space="preserve">STM32 PA3 (RX) ──── ESP8266 TXD</w:t>
+        <w:t xml:space="preserve">STM32 PA3 (RX) ──── ESP8266 TXD
+</w:t>
       </w:r>
     </w:p>
     <w:p>
@@ -2824,7 +3397,8 @@
           <w:sz w:val="19"/>
           <w:szCs w:val="19"/>
         </w:rPr>
-        <w:t xml:space="preserve">STM32 GND      ──── ESP8266 GND</w:t>
+        <w:t xml:space="preserve">STM32 GND      ──── ESP8266 GND
+</w:t>
       </w:r>
     </w:p>
     <w:p>
@@ -2840,7 +3414,8 @@
           <w:sz w:val="19"/>
           <w:szCs w:val="19"/>
         </w:rPr>
-        <w:t xml:space="preserve">STM32 PB1      ──── ESP8266 CH_PD/EN (可选，通过 10kΩ 上拉到 3.3V)</w:t>
+        <w:t xml:space="preserve">STM32 PB1      ──── ESP8266 CH_PD/EN (可选，通过 10kΩ 上拉到 3.3V)
+</w:t>
       </w:r>
     </w:p>
     <w:p/>
@@ -2894,7 +3469,8 @@
           <w:sz w:val="22"/>
           <w:szCs w:val="22"/>
         </w:rPr>
-        <w:t xml:space="preserve">1. 先给 ESP8266 上电，等待 WiFi + MQTT 连接完成 (~5s)</w:t>
+        <w:t xml:space="preserve">1. 先给 ESP8266 上电，等待 WiFi + MQTT 连接完成 (~5s)
+</w:t>
       </w:r>
     </w:p>
     <w:p>
@@ -2908,7 +3484,8 @@
           <w:sz w:val="22"/>
           <w:szCs w:val="22"/>
         </w:rPr>
-        <w:t xml:space="preserve">2. 再给 STM32 上电</w:t>
+        <w:t xml:space="preserve">2. 再给 STM32 上电
+</w:t>
       </w:r>
     </w:p>
     <w:p>
@@ -2922,7 +3499,8 @@
           <w:sz w:val="22"/>
           <w:szCs w:val="22"/>
         </w:rPr>
-        <w:t xml:space="preserve">3. STM32 按 KEY0 → `App_Net_Init()` 执行 CH_PD 低电平复位 ESP8266 → USART2 初始化</w:t>
+        <w:t xml:space="preserve">3. STM32 按 KEY0 → `App_Net_Init()` 执行 CH_PD 低电平复位 ESP8266 → USART2 初始化
+</w:t>
       </w:r>
     </w:p>
     <w:p>
@@ -2936,7 +3514,8 @@
           <w:sz w:val="22"/>
           <w:szCs w:val="22"/>
         </w:rPr>
-        <w:t xml:space="preserve">4. 之后 STM32 每 2s 自动发送 JSON，ESP8266 自动转发到 MQTT</w:t>
+        <w:t xml:space="preserve">4. 之后 STM32 每 2s 自动发送 JSON，ESP8266 自动转发到 MQTT
+</w:t>
       </w:r>
     </w:p>
     <w:p>
@@ -2950,7 +3529,8 @@
           <w:sz w:val="22"/>
           <w:szCs w:val="22"/>
         </w:rPr>
-        <w:t xml:space="preserve">5. MQTT 下发 `ON` → ESP8266 → STM32 收到 `CMD:ON` → 启动逆变器</w:t>
+        <w:t xml:space="preserve">5. MQTT 下发 `ON` → ESP8266 → STM32 收到 `CMD:ON` → 启动逆变器
+</w:t>
       </w:r>
     </w:p>
     <w:p/>

</xml_diff>